<commit_message>
coding and manuscript updates
</commit_message>
<xml_diff>
--- a/manuscript/Variants Prediction Modeling_Main_1126.docx
+++ b/manuscript/Variants Prediction Modeling_Main_1126.docx
@@ -195,6 +195,8 @@
           <w:b/>
           <w:bCs/>
           <w:color w:val="000000" w:themeColor="text1"/>
+          <w:sz w:val="22"/>
+          <w:szCs w:val="22"/>
           <w:lang w:eastAsia="zh-CN"/>
         </w:rPr>
       </w:pPr>
@@ -204,6 +206,8 @@
           <w:b/>
           <w:bCs/>
           <w:color w:val="000000" w:themeColor="text1"/>
+          <w:sz w:val="22"/>
+          <w:szCs w:val="22"/>
           <w:lang w:eastAsia="zh-CN"/>
         </w:rPr>
         <w:t>Significance</w:t>
@@ -283,6 +287,8 @@
           <w:b/>
           <w:bCs/>
           <w:color w:val="000000" w:themeColor="text1"/>
+          <w:sz w:val="22"/>
+          <w:szCs w:val="22"/>
           <w:lang w:eastAsia="ko-KR"/>
         </w:rPr>
       </w:pPr>
@@ -293,6 +299,8 @@
           <w:b/>
           <w:bCs/>
           <w:color w:val="000000" w:themeColor="text1"/>
+          <w:sz w:val="22"/>
+          <w:szCs w:val="22"/>
           <w:lang w:eastAsia="ko-KR"/>
         </w:rPr>
         <w:t>Abstract</w:t>
@@ -308,6 +316,8 @@
         <w:rPr>
           <w:rFonts w:eastAsiaTheme="minorEastAsia"/>
           <w:color w:val="000000" w:themeColor="text1"/>
+          <w:sz w:val="22"/>
+          <w:szCs w:val="22"/>
           <w:lang w:eastAsia="ko-KR"/>
         </w:rPr>
       </w:pPr>
@@ -324,20 +334,20 @@
         <w:rPr>
           <w:rFonts w:eastAsiaTheme="minorEastAsia"/>
           <w:color w:val="000000" w:themeColor="text1"/>
-          <w:sz w:val="21"/>
-          <w:szCs w:val="21"/>
-          <w:lang w:eastAsia="zh-CN"/>
-        </w:rPr>
-      </w:pPr>
-      <w:r>
-        <w:rPr>
-          <w:rFonts w:eastAsiaTheme="minorEastAsia"/>
-          <w:color w:val="000000" w:themeColor="text1"/>
-          <w:sz w:val="21"/>
-          <w:szCs w:val="21"/>
-          <w:lang w:eastAsia="ko-KR"/>
-        </w:rPr>
-        <w:t>The rapid emergence and turnover of SARS-CoV-2 variants underscore the need for early, reliable indicators of which lineages will gain competitive advantage. Yet early genomic trajectories are typically short, sparse, and noisy, with substantial cross-country heterogeneity in sequencing intensity and reporting. We develop a scalable forecasting framework that predicts whether new variants will reach high prevalence and how long they will persist based solely on their initial genomic growth patterns. Using more than nine million sequences from 15 countries (2020–2024), we characterize dominance through peak prevalence and duration above 10% and extract early growth descriptors from the first 2–4 weeks after a lineage surpasses 1%. Across all early-input windows, an ensemble learning model consistently outperforms individual approaches. Variants that ultimately achieve high peaks exhibit strong but structurally coherent early expansion, whereas extended dominance is not associated with rapid early surges but instead with sustained, moderate short-term fluctuations embedded within a stable underlying trajectory. These results demonstrate that the earliest phase of variant emergence contains robust and interpretable signals of subsequent epidemiological impact. The framework further provides practical guidance for genomic surveillance—including minimum sampling thresholds, variant grouping rules, and noise-filtering procedures—and supports cross-country comparison and real-time forecasting. Together, these elements offer a lightweight and reproducible early-warning tool for monitoring the competitive dynamics of emerging SARS-CoV-2 lineages.</w:t>
+          <w:sz w:val="22"/>
+          <w:szCs w:val="22"/>
+          <w:lang w:eastAsia="zh-CN"/>
+        </w:rPr>
+      </w:pPr>
+      <w:r>
+        <w:rPr>
+          <w:rFonts w:eastAsiaTheme="minorEastAsia"/>
+          <w:color w:val="000000" w:themeColor="text1"/>
+          <w:sz w:val="22"/>
+          <w:szCs w:val="22"/>
+          <w:lang w:eastAsia="ko-KR"/>
+        </w:rPr>
+        <w:t>The rapid emergence and turnover of SARS-CoV-2 variants underscore the need for early, reliable indicators of which lineages will gain competitive advantage. Yet early genomic trajectories are typically short, sparse, and noisy, with substantial cross-country heterogeneity in sequencing intensity and reporting. We develop a scalable forecasting framework that predicts whether new variants will reach high prevalence and how long they will persist based on their initial genomic growth patterns. Using more than nine million sequences from 15 countries (2020–2024), we characterize dominance through peak prevalence and duration above 10% and extract early growth descriptors from the first 2–4 weeks after a lineage surpasses 1%. Across all early-input windows, an ensemble learning model consistently outperforms individual approaches. Variants that ultimately achieve high peaks exhibit strong but structurally coherent early expansion, whereas extended dominance is not associated with rapid early surges but instead with sustained, moderate short-term fluctuations embedded within a stable underlying trajectory. These results demonstrate that the earliest phase of variant emergence contains robust and interpretable signals of subsequent epidemiological impact. The framework further provides practical guidance for genomic surveillance—including minimum sampling thresholds, variant grouping rules, and noise-filtering procedures—and supports cross-country comparison and real-time forecasting. Together, these elements offer a lightweight and reproducible early-warning tool for monitoring the competitive dynamics of emerging SARS-CoV-2 lineages.</w:t>
       </w:r>
     </w:p>
     <w:p>
@@ -673,17 +683,7 @@
           <w:szCs w:val="22"/>
           <w:lang w:eastAsia="ko-KR"/>
         </w:rPr>
-        <w:t xml:space="preserve">The challenge is compounded by variability in sequencing capacity across countries, with low-resource settings often facing delays in generating sufficient genomic data to detect emerging variants early. </w:t>
-      </w:r>
-      <w:r>
-        <w:rPr>
-          <w:rFonts w:eastAsiaTheme="minorEastAsia"/>
-          <w:color w:val="000000" w:themeColor="text1"/>
-          <w:sz w:val="22"/>
-          <w:szCs w:val="22"/>
-          <w:lang w:eastAsia="ko-KR"/>
-        </w:rPr>
-        <w:t xml:space="preserve">For instance, </w:t>
+        <w:t>The challenge is compounded by variability in sequencing capacity across countries, with low-</w:t>
       </w:r>
       <w:r>
         <w:rPr>
@@ -694,7 +694,17 @@
           <w:lang w:eastAsia="ko-KR"/>
         </w:rPr>
         <w:lastRenderedPageBreak/>
-        <w:t>while high-sequencing settings (~1,000 sequences/week) enable robust monitoring, regions with limited infrastructure (~100 sequences/week) often face detection delays and incomplete genomic coverage. Recent analyses show that 78% of high-income countries sequenced over 0.5% of their COVID-19 cases, compared with only 42% of low- and middle-income countries</w:t>
+        <w:t xml:space="preserve">resource settings often facing delays in generating sufficient genomic data to detect emerging variants early. </w:t>
+      </w:r>
+      <w:r>
+        <w:rPr>
+          <w:rFonts w:eastAsiaTheme="minorEastAsia"/>
+          <w:color w:val="000000" w:themeColor="text1"/>
+          <w:sz w:val="22"/>
+          <w:szCs w:val="22"/>
+          <w:lang w:eastAsia="ko-KR"/>
+        </w:rPr>
+        <w:t>For instance, while high-sequencing settings (~1,000 sequences/week) enable robust monitoring, regions with limited infrastructure (~100 sequences/week) often face detection delays and incomplete genomic coverage. Recent analyses show that 78% of high-income countries sequenced over 0.5% of their COVID-19 cases, compared with only 42% of low- and middle-income countries</w:t>
       </w:r>
       <w:r>
         <w:rPr>
@@ -1660,7 +1670,16 @@
           <w:sz w:val="22"/>
           <w:szCs w:val="22"/>
         </w:rPr>
-        <w:t xml:space="preserve">The GISAID dataset analyzed here spans daily infection counts for over 3,000 SARS-CoV-2 lineages from January 2020 to May 2024, focusing on the 15 countries with the </w:t>
+        <w:t xml:space="preserve">The GISAID dataset analyzed here spans daily infection counts for over 3,000 SARS-CoV-2 lineages from January 2020 to May 2024, focusing on the 15 countries </w:t>
+      </w:r>
+      <w:r>
+        <w:rPr>
+          <w:color w:val="000000" w:themeColor="text1"/>
+          <w:sz w:val="22"/>
+          <w:szCs w:val="22"/>
+        </w:rPr>
+        <w:lastRenderedPageBreak/>
+        <w:t xml:space="preserve">with the </w:t>
       </w:r>
       <w:r>
         <w:rPr>
@@ -1688,18 +1707,7 @@
           <w:szCs w:val="22"/>
           <w:lang w:eastAsia="ko-KR"/>
         </w:rPr>
-        <w:t xml:space="preserve">the </w:t>
-      </w:r>
-      <w:r>
-        <w:rPr>
-          <w:rFonts w:eastAsiaTheme="minorEastAsia" w:hint="eastAsia"/>
-          <w:color w:val="000000" w:themeColor="text1"/>
-          <w:sz w:val="22"/>
-          <w:szCs w:val="22"/>
-          <w:lang w:eastAsia="ko-KR"/>
-        </w:rPr>
-        <w:lastRenderedPageBreak/>
-        <w:t xml:space="preserve">selected </w:t>
+        <w:t xml:space="preserve">the selected </w:t>
       </w:r>
       <w:r>
         <w:rPr>

</xml_diff>